<commit_message>
FEAT: Persistencia de seccion al recargar + Docs de escalamiento y logros para Claude
</commit_message>
<xml_diff>
--- a/Plan de Negocios Word.docx
+++ b/Plan de Negocios Word.docx
@@ -67,15 +67,7 @@
         <w:spacing w:after="0"/>
       </w:pPr>
       <w:r>
-        <w:t xml:space="preserve">*   **Acceso </w:t>
-      </w:r>
-      <w:proofErr w:type="gramStart"/>
-      <w:r>
-        <w:t>Centralizado:*</w:t>
-      </w:r>
-      <w:proofErr w:type="gramEnd"/>
-      <w:r>
-        <w:t>* Tú eres el "Dueño del Software". El dueño del gimnasio te paga una suscripción mensual.</w:t>
+        <w:t>*   **Acceso Centralizado:** Tú eres el "Dueño del Software". El dueño del gimnasio te paga una suscripción mensual.</w:t>
       </w:r>
     </w:p>
     <w:p>
@@ -94,21 +86,7 @@
         <w:rPr>
           <w:highlight w:val="yellow"/>
         </w:rPr>
-        <w:t xml:space="preserve">Marca </w:t>
-      </w:r>
-      <w:proofErr w:type="gramStart"/>
-      <w:r>
-        <w:rPr>
-          <w:highlight w:val="yellow"/>
-        </w:rPr>
-        <w:t>Blanca:*</w:t>
-      </w:r>
-      <w:proofErr w:type="gramEnd"/>
-      <w:r>
-        <w:rPr>
-          <w:highlight w:val="yellow"/>
-        </w:rPr>
-        <w:t xml:space="preserve">* El gimnasio puede mostrar su logo (Ej. "Gimnasio Titán Power </w:t>
+        <w:t xml:space="preserve">Marca Blanca:** El gimnasio puede mostrar su logo (Ej. "Gimnasio Titán Power </w:t>
       </w:r>
       <w:proofErr w:type="spellStart"/>
       <w:r>
@@ -149,15 +127,7 @@
         <w:spacing w:after="0"/>
       </w:pPr>
       <w:r>
-        <w:t xml:space="preserve">*   **Control de API y </w:t>
-      </w:r>
-      <w:proofErr w:type="gramStart"/>
-      <w:r>
-        <w:t>Escalabilidad:*</w:t>
-      </w:r>
-      <w:proofErr w:type="gramEnd"/>
-      <w:r>
-        <w:t>* Solo tú administras y puedes ver u ocultar las API Keys a través de un código secreto en la app (sin botones visibles para los usuarios o dueños). Crearemos "clones" de la aplicación para dividir a los gimnasios en **bloques de 10 o 20 gimnasios por API Key**. De esta manera evitamos sobrecargar una sola clave y administramos los límites de forma inteligente.</w:t>
+        <w:t>*   **Control de API y Escalabilidad:** Solo tú administras y puedes ver u ocultar las API Keys a través de un código secreto en la app (sin botones visibles para los usuarios o dueños). Crearemos "clones" de la aplicación para dividir a los gimnasios en **bloques de 10 o 20 gimnasios por API Key**. De esta manera evitamos sobrecargar una sola clave y administramos los límites de forma inteligente.</w:t>
       </w:r>
     </w:p>
     <w:p>
@@ -178,36 +148,20 @@
         <w:spacing w:after="0"/>
       </w:pPr>
       <w:r>
-        <w:t xml:space="preserve">*   **Implementación </w:t>
-      </w:r>
-      <w:proofErr w:type="gramStart"/>
-      <w:r>
-        <w:t>Personal:*</w:t>
-      </w:r>
-      <w:proofErr w:type="gramEnd"/>
-      <w:r>
-        <w:t>* Tú te encargarás de crear y llegar directamente a los gimnasios para pegar el **Código QR** en áreas estratégicas (recepción, pesas, espejos). Es un enfoque de marketing de guerrilla.</w:t>
-      </w:r>
-    </w:p>
-    <w:p>
-      <w:pPr>
-        <w:spacing w:after="0"/>
-      </w:pPr>
-    </w:p>
-    <w:p>
-      <w:pPr>
-        <w:spacing w:after="0"/>
-      </w:pPr>
-      <w:r>
-        <w:t xml:space="preserve">*   **Escaneo y Registro </w:t>
-      </w:r>
-      <w:proofErr w:type="gramStart"/>
-      <w:r>
-        <w:t>Directo:*</w:t>
-      </w:r>
-      <w:proofErr w:type="gramEnd"/>
-      <w:r>
-        <w:t>* Cualquier socio del gimnasio lo escanea, se registra en automático bajo la base de datos de ese "bloque/clon", y accede después de pagar su membresía o ser habilitado.</w:t>
+        <w:t>*   **Implementación Personal:** Tú te encargarás de crear y llegar directamente a los gimnasios para pegar el **Código QR** en áreas estratégicas (recepción, pesas, espejos). Es un enfoque de marketing de guerrilla.</w:t>
+      </w:r>
+    </w:p>
+    <w:p>
+      <w:pPr>
+        <w:spacing w:after="0"/>
+      </w:pPr>
+    </w:p>
+    <w:p>
+      <w:pPr>
+        <w:spacing w:after="0"/>
+      </w:pPr>
+      <w:r>
+        <w:t>*   **Escaneo y Registro Directo:** Cualquier socio del gimnasio lo escanea, se registra en automático bajo la base de datos de ese "bloque/clon", y accede después de pagar su membresía o ser habilitado.</w:t>
       </w:r>
     </w:p>
     <w:p>
@@ -228,36 +182,20 @@
         <w:spacing w:after="0"/>
       </w:pPr>
       <w:r>
-        <w:t xml:space="preserve">*   **Uso de </w:t>
-      </w:r>
-      <w:proofErr w:type="gramStart"/>
-      <w:r>
-        <w:t>Stripe:*</w:t>
-      </w:r>
-      <w:proofErr w:type="gramEnd"/>
-      <w:r>
-        <w:t>* Utilizaremos **Stripe** para manejar cobros recurrentes en automático, sin estar cobrando puerta a puerta cada mes.</w:t>
-      </w:r>
-    </w:p>
-    <w:p>
-      <w:pPr>
-        <w:spacing w:after="0"/>
-      </w:pPr>
-    </w:p>
-    <w:p>
-      <w:pPr>
-        <w:spacing w:after="0"/>
-      </w:pPr>
-      <w:r>
-        <w:t>*   **Comisión de Stripe (México 2026</w:t>
-      </w:r>
-      <w:proofErr w:type="gramStart"/>
-      <w:r>
-        <w:t>):*</w:t>
-      </w:r>
-      <w:proofErr w:type="gramEnd"/>
-      <w:r>
-        <w:t xml:space="preserve">* Stripe generalmente cobra un **3.6% + $3.00 MXN** por cada cargo exitoso con tarjeta (crédito o débito), más IVA sobre esa comisión. Es la tarifa estándar más competitiva para pagos online seguros. </w:t>
+        <w:t>*   **Uso de Stripe:** Utilizaremos **Stripe** para manejar cobros recurrentes en automático, sin estar cobrando puerta a puerta cada mes.</w:t>
+      </w:r>
+    </w:p>
+    <w:p>
+      <w:pPr>
+        <w:spacing w:after="0"/>
+      </w:pPr>
+    </w:p>
+    <w:p>
+      <w:pPr>
+        <w:spacing w:after="0"/>
+      </w:pPr>
+      <w:r>
+        <w:t xml:space="preserve">*   **Comisión de Stripe (México 2026):** Stripe generalmente cobra un **3.6% + $3.00 MXN** por cada cargo exitoso con tarjeta (crédito o débito), más IVA sobre esa comisión. Es la tarifa estándar más competitiva para pagos online seguros. </w:t>
       </w:r>
     </w:p>
     <w:p>
@@ -278,15 +216,7 @@
       </w:r>
       <w:proofErr w:type="spellEnd"/>
       <w:r>
-        <w:t xml:space="preserve"> para </w:t>
-      </w:r>
-      <w:proofErr w:type="gramStart"/>
-      <w:r>
-        <w:t>Emprendedores:*</w:t>
-      </w:r>
-      <w:proofErr w:type="gramEnd"/>
-      <w:r>
-        <w:t>* Desde el panel de Stripe generarás los "Links de Pago" y sabrás si la tarjeta del gimnasio no pasó para tomar acciones.</w:t>
+        <w:t xml:space="preserve"> para Emprendedores:** Desde el panel de Stripe generarás los "Links de Pago" y sabrás si la tarjeta del gimnasio no pasó para tomar acciones.</w:t>
       </w:r>
     </w:p>
     <w:p>
@@ -307,15 +237,7 @@
         <w:spacing w:after="0"/>
       </w:pPr>
       <w:r>
-        <w:t xml:space="preserve">*   **Consultoría </w:t>
-      </w:r>
-      <w:proofErr w:type="gramStart"/>
-      <w:r>
-        <w:t>Fiscal:*</w:t>
-      </w:r>
-      <w:proofErr w:type="gramEnd"/>
-      <w:r>
-        <w:t>* Trabajarás directamente con tu contadora (que queda como consultora estrella para revisión estratégica). Le preguntarás sobre el Régimen Simplificado de Confianza (RESICO) y si te conviene por tener pagos digitales y venta de productos.</w:t>
+        <w:t>*   **Consultoría Fiscal:** Trabajarás directamente con tu contadora (que queda como consultora estrella para revisión estratégica). Le preguntarás sobre el Régimen Simplificado de Confianza (RESICO) y si te conviene por tener pagos digitales y venta de productos.</w:t>
       </w:r>
     </w:p>
     <w:p>
@@ -324,15 +246,7 @@
       </w:pPr>
       <w:r>
         <w:lastRenderedPageBreak/>
-        <w:t xml:space="preserve">*   **Facturación </w:t>
-      </w:r>
-      <w:proofErr w:type="gramStart"/>
-      <w:r>
-        <w:t>Futura:*</w:t>
-      </w:r>
-      <w:proofErr w:type="gramEnd"/>
-      <w:r>
-        <w:t>* Dejaremos como una "opción futura" la automatización vía **</w:t>
+        <w:t>*   **Facturación Futura:** Dejaremos como una "opción futura" la automatización vía **</w:t>
       </w:r>
       <w:proofErr w:type="spellStart"/>
       <w:r>
@@ -361,36 +275,20 @@
         <w:spacing w:after="0"/>
       </w:pPr>
       <w:r>
-        <w:t xml:space="preserve">*   **Oculto para </w:t>
-      </w:r>
-      <w:proofErr w:type="gramStart"/>
-      <w:r>
-        <w:t>todos:*</w:t>
-      </w:r>
-      <w:proofErr w:type="gramEnd"/>
-      <w:r>
-        <w:t>* El botón de la API se eliminó de la interfaz gráfica. Los gimnasios no sabrán que existe IA de terceros atrás ni cómo se configura.</w:t>
-      </w:r>
-    </w:p>
-    <w:p>
-      <w:pPr>
-        <w:spacing w:after="0"/>
-      </w:pPr>
-    </w:p>
-    <w:p>
-      <w:pPr>
-        <w:spacing w:after="0"/>
-      </w:pPr>
-      <w:r>
-        <w:t xml:space="preserve">*   **Tu Toque </w:t>
-      </w:r>
-      <w:proofErr w:type="gramStart"/>
-      <w:r>
-        <w:t>Secreto:*</w:t>
-      </w:r>
-      <w:proofErr w:type="gramEnd"/>
-      <w:r>
-        <w:t>* Para ver o cambiar la API Key (solo en tus dispositivos de administración, o al hacer mantenimiento en tu servidor M36), tú (Arthur) deberás tocar 5 veces rápidamente el título "SISTEMA ÉLITE". Así se despliega u oculta de modo seguro.</w:t>
+        <w:t>*   **Oculto para todos:** El botón de la API se eliminó de la interfaz gráfica. Los gimnasios no sabrán que existe IA de terceros atrás ni cómo se configura.</w:t>
+      </w:r>
+    </w:p>
+    <w:p>
+      <w:pPr>
+        <w:spacing w:after="0"/>
+      </w:pPr>
+    </w:p>
+    <w:p>
+      <w:pPr>
+        <w:spacing w:after="0"/>
+      </w:pPr>
+      <w:r>
+        <w:t>*   **Tu Toque Secreto:** Para ver o cambiar la API Key (solo en tus dispositivos de administración, o al hacer mantenimiento en tu servidor M36), tú (Arthur) deberás tocar 5 veces rápidamente el título "SISTEMA ÉLITE". Así se despliega u oculta de modo seguro.</w:t>
       </w:r>
     </w:p>
     <w:p>
@@ -427,13 +325,8 @@
       </w:r>
       <w:proofErr w:type="spellEnd"/>
       <w:r>
-        <w:t>-Pro y tipo de cambio moderado de **$20.00 MXN*</w:t>
-      </w:r>
-      <w:proofErr w:type="gramStart"/>
-      <w:r>
-        <w:t>*.*</w:t>
-      </w:r>
-      <w:proofErr w:type="gramEnd"/>
+        <w:t>-Pro y tipo de cambio moderado de **$20.00 MXN**.*</w:t>
+      </w:r>
     </w:p>
     <w:p>
       <w:pPr>
@@ -453,15 +346,7 @@
         <w:spacing w:after="0"/>
       </w:pPr>
       <w:r>
-        <w:t xml:space="preserve">*   **Costo Operativo por Gimnasio (100 </w:t>
-      </w:r>
-      <w:proofErr w:type="gramStart"/>
-      <w:r>
-        <w:t>socios)*</w:t>
-      </w:r>
-      <w:proofErr w:type="gramEnd"/>
-      <w:r>
-        <w:t>*: **$300 MXN mensuales**.</w:t>
+        <w:t>*   **Costo Operativo por Gimnasio (100 socios)**: **$300 MXN mensuales**.</w:t>
       </w:r>
     </w:p>
     <w:p>
@@ -490,15 +375,7 @@
         <w:spacing w:after="0"/>
       </w:pPr>
       <w:r>
-        <w:t xml:space="preserve">ENTONCES DEBEMOS </w:t>
-      </w:r>
-      <w:proofErr w:type="gramStart"/>
-      <w:r>
-        <w:t>CONTEMPLAR :</w:t>
-      </w:r>
-      <w:proofErr w:type="gramEnd"/>
-      <w:r>
-        <w:t xml:space="preserve"> 500 de api </w:t>
+        <w:t xml:space="preserve">ENTONCES DEBEMOS CONTEMPLAR : 500 de api </w:t>
       </w:r>
       <w:proofErr w:type="spellStart"/>
       <w:r>
@@ -551,21 +428,8 @@
         <w:spacing w:after="0"/>
       </w:pPr>
       <w:r>
-        <w:t xml:space="preserve">*Cifras en </w:t>
-      </w:r>
-      <w:proofErr w:type="gramStart"/>
-      <w:r>
-        <w:t>Pesos Mexicanos</w:t>
-      </w:r>
-      <w:proofErr w:type="gramEnd"/>
-      <w:r>
-        <w:t xml:space="preserve"> (MXN) </w:t>
-      </w:r>
-      <w:proofErr w:type="gramStart"/>
-      <w:r>
-        <w:t>mensuales.*</w:t>
-      </w:r>
-      <w:proofErr w:type="gramEnd"/>
+        <w:t>*Cifras en Pesos Mexicanos (MXN) mensuales.*</w:t>
+      </w:r>
     </w:p>
     <w:p>
       <w:pPr>
@@ -800,15 +664,7 @@
         <w:spacing w:after="0"/>
       </w:pPr>
       <w:r>
-        <w:t xml:space="preserve">*   **Comisión Recurrente**: El vendedor recibe el **25% de la mensualidad ($375 </w:t>
-      </w:r>
-      <w:proofErr w:type="gramStart"/>
-      <w:r>
-        <w:t>MXN)*</w:t>
-      </w:r>
-      <w:proofErr w:type="gramEnd"/>
-      <w:r>
-        <w:t>* por cada gimnasio en su cartera.</w:t>
+        <w:t>*   **Comisión Recurrente**: El vendedor recibe el **25% de la mensualidad ($375 MXN)** por cada gimnasio en su cartera.</w:t>
       </w:r>
     </w:p>
     <w:p>
@@ -876,15 +732,7 @@
         <w:spacing w:after="0"/>
       </w:pPr>
       <w:r>
-        <w:t xml:space="preserve">**Cadenas </w:t>
-      </w:r>
-      <w:proofErr w:type="gramStart"/>
-      <w:r>
-        <w:t>Objetivo:*</w:t>
-      </w:r>
-      <w:proofErr w:type="gramEnd"/>
-      <w:r>
-        <w:t>*</w:t>
+        <w:t>**Cadenas Objetivo:**</w:t>
       </w:r>
     </w:p>
     <w:p>
@@ -937,15 +785,7 @@
       </w:r>
       <w:proofErr w:type="spellEnd"/>
       <w:r>
-        <w:t xml:space="preserve">, Indigo, </w:t>
-      </w:r>
-      <w:proofErr w:type="gramStart"/>
-      <w:r>
-        <w:t>Fitsi)*</w:t>
-      </w:r>
-      <w:proofErr w:type="gramEnd"/>
-      <w:r>
-        <w:t>*: Grupos pequeños de alto valor donde AX-CORE puede ser el diferencial total contra el gimnasio de al lado.</w:t>
+        <w:t>, Indigo, Fitsi)**: Grupos pequeños de alto valor donde AX-CORE puede ser el diferencial total contra el gimnasio de al lado.</w:t>
       </w:r>
     </w:p>
     <w:p>
@@ -1033,13 +873,899 @@
       </w:r>
       <w:proofErr w:type="spellEnd"/>
       <w:r>
-        <w:t xml:space="preserve"> </w:t>
-      </w:r>
-      <w:proofErr w:type="gramStart"/>
-      <w:r>
-        <w:t>ARTHUR.*</w:t>
-      </w:r>
-      <w:proofErr w:type="gramEnd"/>
+        <w:t xml:space="preserve"> ARTHUR.*</w:t>
+      </w:r>
+    </w:p>
+    <w:p>
+      <w:pPr>
+        <w:spacing w:after="0"/>
+      </w:pPr>
+    </w:p>
+    <w:p>
+      <w:pPr>
+        <w:spacing w:after="0"/>
+      </w:pPr>
+    </w:p>
+    <w:p>
+      <w:pPr>
+        <w:spacing w:after="0"/>
+      </w:pPr>
+    </w:p>
+    <w:p>
+      <w:pPr>
+        <w:spacing w:after="0"/>
+      </w:pPr>
+    </w:p>
+    <w:p>
+      <w:pPr>
+        <w:spacing w:after="0"/>
+      </w:pPr>
+    </w:p>
+    <w:p>
+      <w:pPr>
+        <w:spacing w:after="0"/>
+      </w:pPr>
+    </w:p>
+    <w:p>
+      <w:pPr>
+        <w:spacing w:after="0"/>
+      </w:pPr>
+    </w:p>
+    <w:p>
+      <w:pPr>
+        <w:spacing w:after="0"/>
+      </w:pPr>
+    </w:p>
+    <w:p>
+      <w:pPr>
+        <w:spacing w:after="0"/>
+      </w:pPr>
+    </w:p>
+    <w:p>
+      <w:pPr>
+        <w:spacing w:after="0"/>
+      </w:pPr>
+    </w:p>
+    <w:p>
+      <w:pPr>
+        <w:spacing w:after="0"/>
+      </w:pPr>
+    </w:p>
+    <w:p>
+      <w:pPr>
+        <w:spacing w:after="0"/>
+      </w:pPr>
+    </w:p>
+    <w:p>
+      <w:pPr>
+        <w:spacing w:after="0"/>
+      </w:pPr>
+    </w:p>
+    <w:p>
+      <w:pPr>
+        <w:spacing w:after="0"/>
+      </w:pPr>
+    </w:p>
+    <w:p>
+      <w:pPr>
+        <w:spacing w:after="0"/>
+      </w:pPr>
+    </w:p>
+    <w:p>
+      <w:pPr>
+        <w:spacing w:after="0"/>
+      </w:pPr>
+    </w:p>
+    <w:p>
+      <w:pPr>
+        <w:spacing w:after="0"/>
+      </w:pPr>
+    </w:p>
+    <w:p>
+      <w:pPr>
+        <w:spacing w:after="0"/>
+      </w:pPr>
+    </w:p>
+    <w:p>
+      <w:pPr>
+        <w:spacing w:after="0"/>
+      </w:pPr>
+    </w:p>
+    <w:p>
+      <w:pPr>
+        <w:spacing w:after="0"/>
+      </w:pPr>
+    </w:p>
+    <w:p>
+      <w:pPr>
+        <w:spacing w:after="0"/>
+      </w:pPr>
+    </w:p>
+    <w:p>
+      <w:pPr>
+        <w:spacing w:after="0"/>
+      </w:pPr>
+    </w:p>
+    <w:p>
+      <w:pPr>
+        <w:spacing w:after="0"/>
+      </w:pPr>
+    </w:p>
+    <w:p>
+      <w:pPr>
+        <w:spacing w:after="0"/>
+      </w:pPr>
+    </w:p>
+    <w:p>
+      <w:pPr>
+        <w:spacing w:after="0"/>
+      </w:pPr>
+    </w:p>
+    <w:p>
+      <w:pPr>
+        <w:spacing w:after="0"/>
+      </w:pPr>
+    </w:p>
+    <w:p>
+      <w:pPr>
+        <w:spacing w:after="0"/>
+      </w:pPr>
+    </w:p>
+    <w:p>
+      <w:pPr>
+        <w:spacing w:after="0"/>
+      </w:pPr>
+    </w:p>
+    <w:p>
+      <w:pPr>
+        <w:spacing w:after="0"/>
+      </w:pPr>
+    </w:p>
+    <w:p>
+      <w:pPr>
+        <w:spacing w:after="0"/>
+      </w:pPr>
+    </w:p>
+    <w:p>
+      <w:pPr>
+        <w:spacing w:after="0"/>
+      </w:pPr>
+    </w:p>
+    <w:p>
+      <w:pPr>
+        <w:spacing w:after="0"/>
+      </w:pPr>
+    </w:p>
+    <w:p>
+      <w:pPr>
+        <w:spacing w:after="0"/>
+      </w:pPr>
+    </w:p>
+    <w:p>
+      <w:pPr>
+        <w:spacing w:after="0"/>
+      </w:pPr>
+    </w:p>
+    <w:p>
+      <w:pPr>
+        <w:spacing w:after="0"/>
+      </w:pPr>
+    </w:p>
+    <w:p>
+      <w:pPr>
+        <w:spacing w:after="0"/>
+      </w:pPr>
+    </w:p>
+    <w:p>
+      <w:pPr>
+        <w:spacing w:after="0"/>
+      </w:pPr>
+    </w:p>
+    <w:p>
+      <w:pPr>
+        <w:spacing w:after="0"/>
+      </w:pPr>
+    </w:p>
+    <w:p>
+      <w:pPr>
+        <w:spacing w:after="0"/>
+      </w:pPr>
+      <w:r>
+        <w:lastRenderedPageBreak/>
+        <w:t># Inteligencia Artificial en AX-CORE (App de Usuario)</w:t>
+      </w:r>
+    </w:p>
+    <w:p>
+      <w:pPr>
+        <w:spacing w:after="0"/>
+      </w:pPr>
+    </w:p>
+    <w:p>
+      <w:pPr>
+        <w:spacing w:after="0"/>
+      </w:pPr>
+      <w:r>
+        <w:t>Este documento detalla exhaustivamente todos los puntos de contacto estructurales donde la aplicación del usuario (`app.js`) consume la API de Inteligencia Artificial (</w:t>
+      </w:r>
+      <w:proofErr w:type="spellStart"/>
+      <w:r>
+        <w:t>Perplexity</w:t>
+      </w:r>
+      <w:proofErr w:type="spellEnd"/>
+      <w:r>
+        <w:t>). Conocer estos vectores es vital para evaluar la rentabilidad y diseñar un modelo 70/30 (70% código estático/automatizado, 30% IA procesal).</w:t>
+      </w:r>
+    </w:p>
+    <w:p>
+      <w:pPr>
+        <w:spacing w:after="0"/>
+      </w:pPr>
+    </w:p>
+    <w:p>
+      <w:pPr>
+        <w:spacing w:after="0"/>
+      </w:pPr>
+      <w:r>
+        <w:t>La función maestra que dispara estos consumos se llama `</w:t>
+      </w:r>
+      <w:proofErr w:type="spellStart"/>
+      <w:r>
+        <w:t>callPerplexity</w:t>
+      </w:r>
+      <w:proofErr w:type="spellEnd"/>
+      <w:r>
+        <w:t>(</w:t>
+      </w:r>
+      <w:proofErr w:type="spellStart"/>
+      <w:r>
+        <w:t>query</w:t>
+      </w:r>
+      <w:proofErr w:type="spellEnd"/>
+      <w:r>
+        <w:t xml:space="preserve">, </w:t>
+      </w:r>
+      <w:proofErr w:type="spellStart"/>
+      <w:r>
+        <w:t>mode</w:t>
+      </w:r>
+      <w:proofErr w:type="spellEnd"/>
+      <w:r>
+        <w:t>)`. Dependiendo del **modo**, la IA asume roles y costos distintos:</w:t>
+      </w:r>
+    </w:p>
+    <w:p>
+      <w:pPr>
+        <w:spacing w:after="0"/>
+      </w:pPr>
+    </w:p>
+    <w:p>
+      <w:pPr>
+        <w:spacing w:after="0"/>
+      </w:pPr>
+      <w:r>
+        <w:t>---</w:t>
+      </w:r>
+    </w:p>
+    <w:p>
+      <w:pPr>
+        <w:spacing w:after="0"/>
+      </w:pPr>
+    </w:p>
+    <w:p>
+      <w:pPr>
+        <w:spacing w:after="0"/>
+      </w:pPr>
+      <w:r>
+        <w:t>## 1. El Centro de Mando (Chat Interactivo)</w:t>
+      </w:r>
+    </w:p>
+    <w:p>
+      <w:pPr>
+        <w:spacing w:after="0"/>
+      </w:pPr>
+      <w:r>
+        <w:t>**Ubicación:** Pantalla Principal &gt; "Tu Mando Central AX-CORE" &gt; Botón `</w:t>
+      </w:r>
+      <w:proofErr w:type="spellStart"/>
+      <w:r>
+        <w:t>btn</w:t>
+      </w:r>
+      <w:proofErr w:type="spellEnd"/>
+      <w:r>
+        <w:t>-</w:t>
+      </w:r>
+      <w:proofErr w:type="spellStart"/>
+      <w:r>
+        <w:t>send</w:t>
+      </w:r>
+      <w:proofErr w:type="spellEnd"/>
+      <w:r>
+        <w:t>-chat`.</w:t>
+      </w:r>
+    </w:p>
+    <w:p>
+      <w:pPr>
+        <w:spacing w:after="0"/>
+      </w:pPr>
+      <w:r>
+        <w:t>**Modo:** `chat` (Conversacional)</w:t>
+      </w:r>
+    </w:p>
+    <w:p>
+      <w:pPr>
+        <w:spacing w:after="0"/>
+      </w:pPr>
+      <w:r>
+        <w:t>**Frecuencia Estilada:** Alta (Múltiples veces al día por usuario).</w:t>
+      </w:r>
+    </w:p>
+    <w:p>
+      <w:pPr>
+        <w:spacing w:after="0"/>
+      </w:pPr>
+      <w:r>
+        <w:t>**Motivo:** Brindar asesoría en tiempo real como si fuera un nutricionista experto respondiendo dudas personalizadas sobre entrenamiento, salud, o la alimentación consumida hoy.</w:t>
+      </w:r>
+    </w:p>
+    <w:p>
+      <w:pPr>
+        <w:spacing w:after="0"/>
+      </w:pPr>
+    </w:p>
+    <w:p>
+      <w:pPr>
+        <w:spacing w:after="0"/>
+      </w:pPr>
+      <w:r>
+        <w:t xml:space="preserve">Aquí es donde el usuario escribe preguntas directas. Cada vez que el usuario presiona "Enviar", el sistema construye un **Súper </w:t>
+      </w:r>
+      <w:proofErr w:type="spellStart"/>
+      <w:r>
+        <w:t>Prompt</w:t>
+      </w:r>
+      <w:proofErr w:type="spellEnd"/>
+      <w:r>
+        <w:t xml:space="preserve"> Oculto** (Generación Aumentada por Contexto) que inyecta en milisegundos toda la base de datos local del usuario hacia el cerebro de la IA para darle contexto.</w:t>
+      </w:r>
+    </w:p>
+    <w:p>
+      <w:pPr>
+        <w:spacing w:after="0"/>
+      </w:pPr>
+    </w:p>
+    <w:p>
+      <w:pPr>
+        <w:spacing w:after="0"/>
+      </w:pPr>
+      <w:r>
+        <w:t xml:space="preserve">### </w:t>
+      </w:r>
+      <w:proofErr w:type="spellStart"/>
+      <w:r>
+        <w:t>Prompt</w:t>
+      </w:r>
+      <w:proofErr w:type="spellEnd"/>
+      <w:r>
+        <w:t xml:space="preserve"> de Sistema Inyectado:</w:t>
+      </w:r>
+    </w:p>
+    <w:p>
+      <w:pPr>
+        <w:spacing w:after="0"/>
+      </w:pPr>
+      <w:r>
+        <w:t>&gt; *"Eres AX-CORE, el sistema de optimización humana diseñado por ARTHUR para un usuario de [PESO]kg y [ALTURA]m. ESTADO ACTUAL DE HOY: Ingesta: [CALORIAS_HOY] cal de un límite de [LIMITE]. Gasto ejercicio: [QUEMADAS] cal. Déficit histórico: [DEFICIT_TOTAL] cal. DIETA RECOMENDADA: Desayuno: [X], Comida: [Y], Cena: [Z], Snacks: [W]. ALIMENTOS REGISTRADOS HOY: [COMIDA 1], [COMIDA 2]... ESPECIALIDADES: Nutrición avanzada, Biología metabólica, Psicología del éxito, Regeneración celular y Entrenamiento de élite.*</w:t>
+      </w:r>
+    </w:p>
+    <w:p>
+      <w:pPr>
+        <w:spacing w:after="0"/>
+      </w:pPr>
+      <w:r>
+        <w:t>&gt; *REGLAS CRÍTICAS: 1. No uses NUNCA asteriscos... 3. Habla de forma natural... 4. Realiza búsquedas en tiempo real... 5. Considera y menciona proactivamente el ESTADO ACTUAL y ALIMENTOS DE HOY..."*</w:t>
+      </w:r>
+    </w:p>
+    <w:p>
+      <w:pPr>
+        <w:spacing w:after="0"/>
+      </w:pPr>
+    </w:p>
+    <w:p>
+      <w:pPr>
+        <w:spacing w:after="0"/>
+      </w:pPr>
+      <w:r>
+        <w:t xml:space="preserve">**Análisis 70/30:** </w:t>
+      </w:r>
+    </w:p>
+    <w:p>
+      <w:pPr>
+        <w:spacing w:after="0"/>
+      </w:pPr>
+      <w:r>
+        <w:t>Este es el "30%" núcleo de la magia predictiva. No se puede reemplazar fácilmente con código estático porque requiere inteligencia pura para razonar y dar consejos libres. Su consumo es directamente proporcional a las dudas de los usuarios.</w:t>
+      </w:r>
+    </w:p>
+    <w:p>
+      <w:pPr>
+        <w:spacing w:after="0"/>
+      </w:pPr>
+    </w:p>
+    <w:p>
+      <w:pPr>
+        <w:spacing w:after="0"/>
+      </w:pPr>
+      <w:r>
+        <w:t>---</w:t>
+      </w:r>
+    </w:p>
+    <w:p>
+      <w:pPr>
+        <w:spacing w:after="0"/>
+      </w:pPr>
+    </w:p>
+    <w:p>
+      <w:pPr>
+        <w:spacing w:after="0"/>
+      </w:pPr>
+      <w:r>
+        <w:t>## 2. Escáner de Dietas (Lectura Comprensiva de Texto Humano)</w:t>
+      </w:r>
+    </w:p>
+    <w:p>
+      <w:pPr>
+        <w:spacing w:after="0"/>
+      </w:pPr>
+      <w:r>
+        <w:lastRenderedPageBreak/>
+        <w:t>**Ubicación:** Menú &gt; Tu Dieta &gt; Cuadro de Texto "Pega tu dieta en bruto" &gt; Botón `</w:t>
+      </w:r>
+      <w:proofErr w:type="spellStart"/>
+      <w:r>
+        <w:t>btn-parse-diet</w:t>
+      </w:r>
+      <w:proofErr w:type="spellEnd"/>
+      <w:r>
+        <w:t>`.</w:t>
+      </w:r>
+    </w:p>
+    <w:p>
+      <w:pPr>
+        <w:spacing w:after="0"/>
+      </w:pPr>
+      <w:r>
+        <w:t>**Modo:** `</w:t>
+      </w:r>
+      <w:proofErr w:type="spellStart"/>
+      <w:r>
+        <w:t>json</w:t>
+      </w:r>
+      <w:proofErr w:type="spellEnd"/>
+      <w:r>
+        <w:t>` (Extracción Estructurada)</w:t>
+      </w:r>
+    </w:p>
+    <w:p>
+      <w:pPr>
+        <w:spacing w:after="0"/>
+      </w:pPr>
+      <w:r>
+        <w:t>**Frecuencia Estilada:** Muy baja (Idealmente 1 o 2 veces al mes por usuario).</w:t>
+      </w:r>
+    </w:p>
+    <w:p>
+      <w:pPr>
+        <w:spacing w:after="0"/>
+      </w:pPr>
+      <w:r>
+        <w:t xml:space="preserve">**Motivo:** Evitar que el usuario tenga que llenar formularios difíciles (Desayuno, Comida, </w:t>
+      </w:r>
+      <w:proofErr w:type="spellStart"/>
+      <w:r>
+        <w:t>etc</w:t>
+      </w:r>
+      <w:proofErr w:type="spellEnd"/>
+      <w:r>
+        <w:t>). En su lugar, el usuario pega el texto en bruto que le mandó su nutriólogo y la IA se encarga de leerlo, entenderlo y ordenarlo.</w:t>
+      </w:r>
+    </w:p>
+    <w:p>
+      <w:pPr>
+        <w:spacing w:after="0"/>
+      </w:pPr>
+    </w:p>
+    <w:p>
+      <w:pPr>
+        <w:spacing w:after="0"/>
+      </w:pPr>
+      <w:r>
+        <w:t>El sistema realiza **2 consumos consecutivos de IA** en segundo plano (fracciones de segundo):</w:t>
+      </w:r>
+    </w:p>
+    <w:p>
+      <w:pPr>
+        <w:spacing w:after="0"/>
+      </w:pPr>
+    </w:p>
+    <w:p>
+      <w:pPr>
+        <w:spacing w:after="0"/>
+      </w:pPr>
+      <w:r>
+        <w:t>### Consumo A (Organizador JSON):</w:t>
+      </w:r>
+    </w:p>
+    <w:p>
+      <w:pPr>
+        <w:spacing w:after="0"/>
+      </w:pPr>
+      <w:r>
+        <w:t xml:space="preserve">&gt; *"Extrae u organiza el siguiente texto en las comidas requeridas. Responde estrictamente con un JSON válido, sin </w:t>
+      </w:r>
+      <w:proofErr w:type="spellStart"/>
+      <w:r>
+        <w:t>Markdown</w:t>
+      </w:r>
+      <w:proofErr w:type="spellEnd"/>
+      <w:r>
+        <w:t>, con las claves exactas: '</w:t>
+      </w:r>
+      <w:proofErr w:type="spellStart"/>
+      <w:r>
+        <w:t>breakfast</w:t>
+      </w:r>
+      <w:proofErr w:type="spellEnd"/>
+      <w:r>
+        <w:t>', 'lunch', '</w:t>
+      </w:r>
+      <w:proofErr w:type="spellStart"/>
+      <w:r>
+        <w:t>dinner</w:t>
+      </w:r>
+      <w:proofErr w:type="spellEnd"/>
+      <w:r>
+        <w:t>', 'snacks'. Si alguna no existe, déjala vacía. Texto a analizar: [TEXTO PEGADO]"*</w:t>
+      </w:r>
+    </w:p>
+    <w:p>
+      <w:pPr>
+        <w:spacing w:after="0"/>
+      </w:pPr>
+    </w:p>
+    <w:p>
+      <w:pPr>
+        <w:spacing w:after="0"/>
+      </w:pPr>
+      <w:r>
+        <w:t>### Consumo B (Creador Dinámico de Reglas de Oro):</w:t>
+      </w:r>
+    </w:p>
+    <w:p>
+      <w:pPr>
+        <w:spacing w:after="0"/>
+      </w:pPr>
+      <w:r>
+        <w:t>Inmediatamente después de extraer los alimentos, la app vuelve a llamar a la IA para crear leyes estrictas basadas a la medida de los alimentos recetados en esa dieta en particular.</w:t>
+      </w:r>
+    </w:p>
+    <w:p>
+      <w:pPr>
+        <w:spacing w:after="0"/>
+      </w:pPr>
+      <w:r>
+        <w:t>&gt; *"Basándote en esta dieta de un nutriólogo, genera entre 5 y 8 REGLAS ESTRUCTURALES concisas y claras que el usuario debe seguir para maximizar los resultados de esta dieta específica... Responde SOLO con un JSON válido con la clave 'rules'..."*</w:t>
+      </w:r>
+    </w:p>
+    <w:p>
+      <w:pPr>
+        <w:spacing w:after="0"/>
+      </w:pPr>
+    </w:p>
+    <w:p>
+      <w:pPr>
+        <w:spacing w:after="0"/>
+      </w:pPr>
+      <w:r>
+        <w:t>**Análisis 70/30:**</w:t>
+      </w:r>
+    </w:p>
+    <w:p>
+      <w:pPr>
+        <w:spacing w:after="0"/>
+      </w:pPr>
+      <w:r>
+        <w:t>Como es un uso extremadamente esporádico (solo cuando cambian de dieta), vale cada centavo. La fricción para el usuario es cero y parecerá magia.</w:t>
+      </w:r>
+    </w:p>
+    <w:p>
+      <w:pPr>
+        <w:spacing w:after="0"/>
+      </w:pPr>
+    </w:p>
+    <w:p>
+      <w:pPr>
+        <w:spacing w:after="0"/>
+      </w:pPr>
+      <w:r>
+        <w:t>---</w:t>
+      </w:r>
+    </w:p>
+    <w:p>
+      <w:pPr>
+        <w:spacing w:after="0"/>
+      </w:pPr>
+    </w:p>
+    <w:p>
+      <w:pPr>
+        <w:spacing w:after="0"/>
+      </w:pPr>
+      <w:r>
+        <w:t>## 3. Buscador Automático de Calorías (Log de Comidas)</w:t>
+      </w:r>
+    </w:p>
+    <w:p>
+      <w:pPr>
+        <w:spacing w:after="0"/>
+      </w:pPr>
+      <w:r>
+        <w:t>**Ubicación:** Log de Comidas / Escáner &gt; Cuadro de texto &gt; Botón `</w:t>
+      </w:r>
+      <w:proofErr w:type="spellStart"/>
+      <w:r>
+        <w:t>btn-add-food</w:t>
+      </w:r>
+      <w:proofErr w:type="spellEnd"/>
+      <w:r>
+        <w:t>` ("Consultando IA...").</w:t>
+      </w:r>
+    </w:p>
+    <w:p>
+      <w:pPr>
+        <w:spacing w:after="0"/>
+      </w:pPr>
+      <w:r>
+        <w:t>**Modo:** `</w:t>
+      </w:r>
+      <w:proofErr w:type="spellStart"/>
+      <w:r>
+        <w:t>number</w:t>
+      </w:r>
+      <w:proofErr w:type="spellEnd"/>
+      <w:r>
+        <w:t>` (Buscador Web Predictivo)</w:t>
+      </w:r>
+    </w:p>
+    <w:p>
+      <w:pPr>
+        <w:spacing w:after="0"/>
+      </w:pPr>
+      <w:r>
+        <w:t>**Frecuencia Estilada:** Media-Alta (3 a 5 veces al día por usuario).</w:t>
+      </w:r>
+    </w:p>
+    <w:p>
+      <w:pPr>
+        <w:spacing w:after="0"/>
+      </w:pPr>
+      <w:r>
+        <w:t>**Motivo:** Para que el progreso de "Déficit Calórico" del atleta sea exacto, él solo tiene que escribir "Dos rebanadas de pizza de pepperoni" y la IA navega en internet rápidamente para obtener el total de calorías de ese alimento y sumarlo a su barra de "Consumidas Hoy".</w:t>
+      </w:r>
+    </w:p>
+    <w:p>
+      <w:pPr>
+        <w:spacing w:after="0"/>
+      </w:pPr>
+    </w:p>
+    <w:p>
+      <w:pPr>
+        <w:spacing w:after="0"/>
+      </w:pPr>
+      <w:r>
+        <w:t xml:space="preserve">### </w:t>
+      </w:r>
+      <w:proofErr w:type="spellStart"/>
+      <w:r>
+        <w:t>Prompt</w:t>
+      </w:r>
+      <w:proofErr w:type="spellEnd"/>
+      <w:r>
+        <w:t xml:space="preserve"> Utilizado:</w:t>
+      </w:r>
+    </w:p>
+    <w:p>
+      <w:pPr>
+        <w:spacing w:after="0"/>
+      </w:pPr>
+      <w:r>
+        <w:t xml:space="preserve">&gt; *"Busca en fuentes actuales de nutrición y bases de datos como USDA, </w:t>
+      </w:r>
+      <w:proofErr w:type="spellStart"/>
+      <w:r>
+        <w:t>Cronometer</w:t>
+      </w:r>
+      <w:proofErr w:type="spellEnd"/>
+      <w:r>
+        <w:t xml:space="preserve"> o </w:t>
+      </w:r>
+      <w:proofErr w:type="spellStart"/>
+      <w:r>
+        <w:t>FatSecret</w:t>
+      </w:r>
+      <w:proofErr w:type="spellEnd"/>
+      <w:r>
+        <w:t xml:space="preserve"> las calorías exactas de: '[TEXTO DEL USUARIO]'. Dame SOLAMENTE un número entero con las calorías. Si hay rango, usa el promedio. No des texto adicional, solo el número."*</w:t>
+      </w:r>
+    </w:p>
+    <w:p>
+      <w:pPr>
+        <w:spacing w:after="0"/>
+      </w:pPr>
+    </w:p>
+    <w:p>
+      <w:pPr>
+        <w:spacing w:after="0"/>
+      </w:pPr>
+      <w:r>
+        <w:t>El código de AX-CORE recibe el texto (Ej. `"560"`), y programa la barriga roja para sumar esas 560 Calorías.</w:t>
+      </w:r>
+    </w:p>
+    <w:p>
+      <w:pPr>
+        <w:spacing w:after="0"/>
+      </w:pPr>
+    </w:p>
+    <w:p>
+      <w:pPr>
+        <w:spacing w:after="0"/>
+      </w:pPr>
+      <w:r>
+        <w:t>**Análisis 70/30:**</w:t>
+      </w:r>
+    </w:p>
+    <w:p>
+      <w:pPr>
+        <w:spacing w:after="0"/>
+      </w:pPr>
+      <w:r>
+        <w:t>Llamar a la IA **cada vez** que un usuario come algo es brutalmente excelente en experiencia de usuario porque nunca le van a atinar con fallas exactas, pero se puede volver tu sumidero financiero más grande en la aplicación debido a la alta frecuencia.</w:t>
+      </w:r>
+    </w:p>
+    <w:p>
+      <w:pPr>
+        <w:spacing w:after="0"/>
+      </w:pPr>
+    </w:p>
+    <w:p>
+      <w:pPr>
+        <w:spacing w:after="0"/>
+      </w:pPr>
+      <w:r>
+        <w:t>### Estrategia de Mitigación 70/30 en el Log de Comidas:</w:t>
+      </w:r>
+    </w:p>
+    <w:p>
+      <w:pPr>
+        <w:spacing w:after="0"/>
+      </w:pPr>
+      <w:r>
+        <w:t xml:space="preserve">Podríamos en el futuro escribir un "Array" (lista de código gratis de unos 500 alimentos genéricos en Español). </w:t>
+      </w:r>
+    </w:p>
+    <w:p>
+      <w:pPr>
+        <w:spacing w:after="0"/>
+      </w:pPr>
+      <w:r>
+        <w:t xml:space="preserve">1. Cuando un Atleta escribe "Pollo </w:t>
+      </w:r>
+      <w:proofErr w:type="spellStart"/>
+      <w:r>
+        <w:t>azado</w:t>
+      </w:r>
+      <w:proofErr w:type="spellEnd"/>
+      <w:r>
+        <w:t xml:space="preserve"> 200g".</w:t>
+      </w:r>
+    </w:p>
+    <w:p>
+      <w:pPr>
+        <w:spacing w:after="0"/>
+      </w:pPr>
+      <w:r>
+        <w:t>2. Nuestro código (Gratis - 70%), buscará la palabra "Pollo" y le dará 300 kcal. **Se salta a la IA.**</w:t>
+      </w:r>
+    </w:p>
+    <w:p>
+      <w:pPr>
+        <w:spacing w:after="0"/>
+      </w:pPr>
+      <w:r>
+        <w:t>3. Si la Palabra es "Tamal Oaxaqueño con Champurrado" y nuestro código no puede comprender la mezcla.</w:t>
+      </w:r>
+    </w:p>
+    <w:p>
+      <w:pPr>
+        <w:spacing w:after="0"/>
+      </w:pPr>
+      <w:r>
+        <w:t>4. Activamos la Inteligencia (Costo IA 30%) y ahí sí le vamos a preguntar al oráculo.</w:t>
+      </w:r>
+    </w:p>
+    <w:p>
+      <w:pPr>
+        <w:spacing w:after="0"/>
+      </w:pPr>
+    </w:p>
+    <w:p>
+      <w:pPr>
+        <w:spacing w:after="0"/>
+      </w:pPr>
+      <w:r>
+        <w:t>---</w:t>
+      </w:r>
+    </w:p>
+    <w:p>
+      <w:pPr>
+        <w:spacing w:after="0"/>
+      </w:pPr>
+    </w:p>
+    <w:p>
+      <w:pPr>
+        <w:spacing w:after="0"/>
+      </w:pPr>
+      <w:r>
+        <w:t>## Resumen Final</w:t>
+      </w:r>
+    </w:p>
+    <w:p>
+      <w:pPr>
+        <w:spacing w:after="0"/>
+      </w:pPr>
+    </w:p>
+    <w:p>
+      <w:pPr>
+        <w:spacing w:after="0"/>
+      </w:pPr>
+      <w:r>
+        <w:t xml:space="preserve">Toda la aplicación de </w:t>
+      </w:r>
+      <w:proofErr w:type="spellStart"/>
+      <w:r>
+        <w:t>Frontend</w:t>
+      </w:r>
+      <w:proofErr w:type="spellEnd"/>
+      <w:r>
+        <w:t xml:space="preserve"> procesa su Inteligencia de manera magistral usando el inyector `</w:t>
+      </w:r>
+      <w:proofErr w:type="spellStart"/>
+      <w:r>
+        <w:t>callPerplexity</w:t>
+      </w:r>
+      <w:proofErr w:type="spellEnd"/>
+      <w:r>
+        <w:t>`. Su mayor virtud es que en los Puntos 2 y 3, no solo es texto... le obligamos a la IA a que nos responda en `JSON` o números enteros que nosotros interceptamos para darle forma geométrica y estadística a nuestra UI.</w:t>
+      </w:r>
+    </w:p>
+    <w:p>
+      <w:pPr>
+        <w:spacing w:after="0"/>
+      </w:pPr>
+    </w:p>
+    <w:p>
+      <w:pPr>
+        <w:spacing w:after="0"/>
+      </w:pPr>
+      <w:r>
+        <w:t xml:space="preserve">Pero este "super poder" exige que mires las estadísticas. Si logras 4,000 usuarios recurrentes. Todos esos "Puntos #3 (Calculador de Calorías)" destrozarán una Tarjeta de Crédito en API. Necesitas sí o sí cambiarte los sesos por debajo a </w:t>
+      </w:r>
+      <w:proofErr w:type="spellStart"/>
+      <w:r>
+        <w:t>OpenAI</w:t>
+      </w:r>
+      <w:proofErr w:type="spellEnd"/>
+      <w:r>
+        <w:t xml:space="preserve"> o Gemini 2.0 en cuanto empieces la distribución escalonada.</w:t>
+      </w:r>
     </w:p>
     <w:sectPr>
       <w:pgSz w:w="12240" w:h="15840"/>

</xml_diff>